<commit_message>
Version 4.1 ready for release
Version 4.1 ready for release
</commit_message>
<xml_diff>
--- a/Check-In User Guide.docx
+++ b/Check-In User Guide.docx
@@ -15,7 +15,10 @@
         <w:pStyle w:val="Subtitle"/>
       </w:pPr>
       <w:r>
-        <w:t>CAP Check-In Application Version v4.0</w:t>
+        <w:t>CAP Check-In Application Version v4.</w:t>
+      </w:r>
+      <w:r>
+        <w:t>1</w:t>
       </w:r>
     </w:p>
     <w:p>
@@ -90,7 +93,31 @@
         <w:pStyle w:val="ListParagraph"/>
       </w:pPr>
       <w:r>
-        <w:t>- Windows 10 or newer.</w:t>
+        <w:t xml:space="preserve">- </w:t>
+      </w:r>
+      <w:r>
+        <w:t>MacOS arm</w:t>
+      </w:r>
+      <w:r>
+        <w:t xml:space="preserve"> processor or </w:t>
+      </w:r>
+      <w:r>
+        <w:t>Windows 10</w:t>
+      </w:r>
+      <w:r>
+        <w:t xml:space="preserve">+ </w:t>
+      </w:r>
+      <w:r>
+        <w:t>(Windows 10 is no longer supported by Microsoft</w:t>
+      </w:r>
+      <w:r>
+        <w:t xml:space="preserve"> so Windows 11 is recommended</w:t>
+      </w:r>
+      <w:r>
+        <w:t>)</w:t>
+      </w:r>
+      <w:r>
+        <w:t>.</w:t>
       </w:r>
     </w:p>
     <w:p>
@@ -638,22 +665,16 @@
               <w:t xml:space="preserve">Works </w:t>
             </w:r>
             <w:r>
-              <w:t xml:space="preserve">great with the 2D front of card </w:t>
+              <w:t xml:space="preserve">great </w:t>
             </w:r>
             <w:r>
-              <w:t xml:space="preserve">codes. Does not read the back 1D code for some </w:t>
-            </w:r>
-            <w:r>
-              <w:t>mambers</w:t>
+              <w:t>after scanning the factory reset code</w:t>
             </w:r>
             <w:r>
               <w:t>.</w:t>
             </w:r>
             <w:r>
-              <w:t xml:space="preserve"> Will test settings to see if it can be fixed. Did have a problem with double scan. </w:t>
-            </w:r>
-            <w:r>
-              <w:t>Used the instructions to slow it down.</w:t>
+              <w:t xml:space="preserve"> Gets both front 2D and back 1D codes.</w:t>
             </w:r>
           </w:p>
           <w:p/>
@@ -868,10 +889,7 @@
         <w:pStyle w:val="Heading1"/>
       </w:pPr>
       <w:r>
-        <w:t xml:space="preserve">Tools Tab: </w:t>
-      </w:r>
-      <w:r>
-        <w:t>eServices Attendance Import</w:t>
+        <w:t>Tools Tab: eServices Attendance Import</w:t>
       </w:r>
     </w:p>
     <w:p>
@@ -955,10 +973,7 @@
       </w:pPr>
       <w:r>
         <w:lastRenderedPageBreak/>
-        <w:t xml:space="preserve">Tools Tab: </w:t>
-      </w:r>
-      <w:r>
-        <w:t>Member Report Import</w:t>
+        <w:t>Tools Tab: Member Report Import</w:t>
       </w:r>
     </w:p>
     <w:p>
@@ -1291,10 +1306,7 @@
         <w:pStyle w:val="Heading1"/>
       </w:pPr>
       <w:r>
-        <w:t xml:space="preserve">Web App: </w:t>
-      </w:r>
-      <w:r>
-        <w:t>HTTPS and Certificates</w:t>
+        <w:t>Web App: HTTPS and Certificates</w:t>
       </w:r>
     </w:p>
     <w:p>
@@ -1350,10 +1362,7 @@
         <w:pStyle w:val="Heading1"/>
       </w:pPr>
       <w:r>
-        <w:t xml:space="preserve">Web App: </w:t>
-      </w:r>
-      <w:r>
-        <w:t>Windows Firewall</w:t>
+        <w:t>Web App: Windows Firewall</w:t>
       </w:r>
       <w:r>
         <w:t xml:space="preserve"> (Not available on MacOS)</w:t>
@@ -1408,10 +1417,7 @@
         <w:pStyle w:val="Heading1"/>
       </w:pPr>
       <w:r>
-        <w:t xml:space="preserve">Web App: </w:t>
-      </w:r>
-      <w:r>
-        <w:t>Blocked IP Addresses</w:t>
+        <w:t>Web App: Blocked IP Addresses</w:t>
       </w:r>
     </w:p>
     <w:p>
@@ -14770,25 +14776,32 @@
 </file>
 
 <file path=customXml/item1.xml><?xml version="1.0" encoding="utf-8"?>
+<b:Sources xmlns:b="http://schemas.openxmlformats.org/officeDocument/2006/bibliography" xmlns="http://schemas.openxmlformats.org/officeDocument/2006/bibliography" SelectedStyle="/APA.XSL" StyleName="APA"/>
+</file>
+
+<file path=customXml/item2.xml><?xml version="1.0" encoding="utf-8"?>
 <p:properties xmlns:p="http://schemas.microsoft.com/office/2006/metadata/properties" xmlns:xsi="http://www.w3.org/2001/XMLSchema-instance" xmlns:pc="http://schemas.microsoft.com/office/infopath/2007/PartnerControls">
   <documentManagement>
-    <lcf76f155ced4ddcb4097134ff3c332f xmlns="8329c55f-d416-4a1f-b2d3-fc9ae7cbffd5">
+    <lcf76f155ced4ddcb4097134ff3c332f xmlns="23a8e06d-7422-43a7-9a1b-52b8c23ca3f8">
       <Terms xmlns="http://schemas.microsoft.com/office/infopath/2007/PartnerControls"/>
     </lcf76f155ced4ddcb4097134ff3c332f>
-    <TaxCatchAll xmlns="2933af51-6e9d-478c-9ebc-1dbb8c3cbba4" xsi:nil="true"/>
   </documentManagement>
 </p:properties>
 </file>
 
-<file path=customXml/item2.xml><?xml version="1.0" encoding="utf-8"?>
-<b:Sources xmlns:b="http://schemas.openxmlformats.org/officeDocument/2006/bibliography" xmlns="http://schemas.openxmlformats.org/officeDocument/2006/bibliography" SelectedStyle="/APA.XSL" StyleName="APA"/>
+<file path=customXml/item3.xml><?xml version="1.0" encoding="utf-8"?>
+<?mso-contentType ?>
+<FormTemplates xmlns="http://schemas.microsoft.com/sharepoint/v3/contenttype/forms">
+  <Display>DocumentLibraryForm</Display>
+  <Edit>DocumentLibraryForm</Edit>
+  <New>DocumentLibraryForm</New>
+</FormTemplates>
 </file>
 
-<file path=customXml/item3.xml><?xml version="1.0" encoding="utf-8"?>
-<ct:contentTypeSchema xmlns:ct="http://schemas.microsoft.com/office/2006/metadata/contentType" xmlns:ma="http://schemas.microsoft.com/office/2006/metadata/properties/metaAttributes" ct:_="" ma:_="" ma:contentTypeName="Document" ma:contentTypeID="0x010100A68156EF363C714094CC0E7BB8756037" ma:contentTypeVersion="11" ma:contentTypeDescription="Create a new document." ma:contentTypeScope="" ma:versionID="f43589660cc04eee1133e7489d2ba1bf">
-  <xsd:schema xmlns:xsd="http://www.w3.org/2001/XMLSchema" xmlns:xs="http://www.w3.org/2001/XMLSchema" xmlns:p="http://schemas.microsoft.com/office/2006/metadata/properties" xmlns:ns2="8329c55f-d416-4a1f-b2d3-fc9ae7cbffd5" xmlns:ns3="2933af51-6e9d-478c-9ebc-1dbb8c3cbba4" targetNamespace="http://schemas.microsoft.com/office/2006/metadata/properties" ma:root="true" ma:fieldsID="c46cc283918e5335c41166e712ab5d06" ns2:_="" ns3:_="">
-    <xsd:import namespace="8329c55f-d416-4a1f-b2d3-fc9ae7cbffd5"/>
-    <xsd:import namespace="2933af51-6e9d-478c-9ebc-1dbb8c3cbba4"/>
+<file path=customXml/item4.xml><?xml version="1.0" encoding="utf-8"?>
+<ct:contentTypeSchema xmlns:ct="http://schemas.microsoft.com/office/2006/metadata/contentType" xmlns:ma="http://schemas.microsoft.com/office/2006/metadata/properties/metaAttributes" ct:_="" ma:_="" ma:contentTypeName="Document" ma:contentTypeID="0x010100381AE46A2FB4774ABED3FF17C2EA98B5" ma:contentTypeVersion="9" ma:contentTypeDescription="Create a new document." ma:contentTypeScope="" ma:versionID="21727f2cb9449552c878602a8ae0ec24">
+  <xsd:schema xmlns:xsd="http://www.w3.org/2001/XMLSchema" xmlns:xs="http://www.w3.org/2001/XMLSchema" xmlns:p="http://schemas.microsoft.com/office/2006/metadata/properties" xmlns:ns2="23a8e06d-7422-43a7-9a1b-52b8c23ca3f8" targetNamespace="http://schemas.microsoft.com/office/2006/metadata/properties" ma:root="true" ma:fieldsID="8e1531cc360e53382736c1a13c43380b" ns2:_="">
+    <xsd:import namespace="23a8e06d-7422-43a7-9a1b-52b8c23ca3f8"/>
     <xsd:element name="properties">
       <xsd:complexType>
         <xsd:sequence>
@@ -14798,13 +14811,11 @@
                 <xsd:element ref="ns2:MediaServiceMetadata" minOccurs="0"/>
                 <xsd:element ref="ns2:MediaServiceFastMetadata" minOccurs="0"/>
                 <xsd:element ref="ns2:MediaServiceSearchProperties" minOccurs="0"/>
+                <xsd:element ref="ns2:MediaServiceDateTaken" minOccurs="0"/>
+                <xsd:element ref="ns2:lcf76f155ced4ddcb4097134ff3c332f" minOccurs="0"/>
+                <xsd:element ref="ns2:MediaServiceOCR" minOccurs="0"/>
                 <xsd:element ref="ns2:MediaServiceGenerationTime" minOccurs="0"/>
                 <xsd:element ref="ns2:MediaServiceEventHashCode" minOccurs="0"/>
-                <xsd:element ref="ns2:MediaLengthInSeconds" minOccurs="0"/>
-                <xsd:element ref="ns2:MediaServiceDateTaken" minOccurs="0"/>
-                <xsd:element ref="ns2:lcf76f155ced4ddcb4097134ff3c332f" minOccurs="0"/>
-                <xsd:element ref="ns3:TaxCatchAll" minOccurs="0"/>
-                <xsd:element ref="ns2:MediaServiceOCR" minOccurs="0"/>
               </xsd:all>
             </xsd:complexType>
           </xsd:element>
@@ -14812,7 +14823,7 @@
       </xsd:complexType>
     </xsd:element>
   </xsd:schema>
-  <xsd:schema xmlns:xsd="http://www.w3.org/2001/XMLSchema" xmlns:xs="http://www.w3.org/2001/XMLSchema" xmlns:dms="http://schemas.microsoft.com/office/2006/documentManagement/types" xmlns:pc="http://schemas.microsoft.com/office/infopath/2007/PartnerControls" targetNamespace="8329c55f-d416-4a1f-b2d3-fc9ae7cbffd5" elementFormDefault="qualified">
+  <xsd:schema xmlns:xsd="http://www.w3.org/2001/XMLSchema" xmlns:xs="http://www.w3.org/2001/XMLSchema" xmlns:dms="http://schemas.microsoft.com/office/2006/documentManagement/types" xmlns:pc="http://schemas.microsoft.com/office/infopath/2007/PartnerControls" targetNamespace="23a8e06d-7422-43a7-9a1b-52b8c23ca3f8" elementFormDefault="qualified">
     <xsd:import namespace="http://schemas.microsoft.com/office/2006/documentManagement/types"/>
     <xsd:import namespace="http://schemas.microsoft.com/office/infopath/2007/PartnerControls"/>
     <xsd:element name="MediaServiceMetadata" ma:index="8" nillable="true" ma:displayName="MediaServiceMetadata" ma:hidden="true" ma:internalName="MediaServiceMetadata" ma:readOnly="true">
@@ -14830,54 +14841,34 @@
         <xsd:restriction base="dms:Note"/>
       </xsd:simpleType>
     </xsd:element>
-    <xsd:element name="MediaServiceGenerationTime" ma:index="11" nillable="true" ma:displayName="MediaServiceGenerationTime" ma:hidden="true" ma:internalName="MediaServiceGenerationTime" ma:readOnly="true">
+    <xsd:element name="MediaServiceDateTaken" ma:index="11" nillable="true" ma:displayName="MediaServiceDateTaken" ma:hidden="true" ma:indexed="true" ma:internalName="MediaServiceDateTaken" ma:readOnly="true">
       <xsd:simpleType>
         <xsd:restriction base="dms:Text"/>
       </xsd:simpleType>
     </xsd:element>
-    <xsd:element name="MediaServiceEventHashCode" ma:index="12" nillable="true" ma:displayName="MediaServiceEventHashCode" ma:hidden="true" ma:internalName="MediaServiceEventHashCode" ma:readOnly="true">
-      <xsd:simpleType>
-        <xsd:restriction base="dms:Text"/>
-      </xsd:simpleType>
-    </xsd:element>
-    <xsd:element name="MediaLengthInSeconds" ma:index="13" nillable="true" ma:displayName="MediaLengthInSeconds" ma:hidden="true" ma:internalName="MediaLengthInSeconds" ma:readOnly="true">
-      <xsd:simpleType>
-        <xsd:restriction base="dms:Unknown"/>
-      </xsd:simpleType>
-    </xsd:element>
-    <xsd:element name="MediaServiceDateTaken" ma:index="14" nillable="true" ma:displayName="MediaServiceDateTaken" ma:hidden="true" ma:indexed="true" ma:internalName="MediaServiceDateTaken" ma:readOnly="true">
-      <xsd:simpleType>
-        <xsd:restriction base="dms:Text"/>
-      </xsd:simpleType>
-    </xsd:element>
-    <xsd:element name="lcf76f155ced4ddcb4097134ff3c332f" ma:index="16" nillable="true" ma:taxonomy="true" ma:internalName="lcf76f155ced4ddcb4097134ff3c332f" ma:taxonomyFieldName="MediaServiceImageTags" ma:displayName="Image Tags" ma:readOnly="false" ma:fieldId="{5cf76f15-5ced-4ddc-b409-7134ff3c332f}" ma:taxonomyMulti="true" ma:sspId="377c0c84-274e-4e18-9d0b-7c009be74b2d" ma:termSetId="09814cd3-568e-fe90-9814-8d621ff8fb84" ma:anchorId="fba54fb3-c3e1-fe81-a776-ca4b69148c4d" ma:open="true" ma:isKeyword="false">
+    <xsd:element name="lcf76f155ced4ddcb4097134ff3c332f" ma:index="13" nillable="true" ma:taxonomy="true" ma:internalName="lcf76f155ced4ddcb4097134ff3c332f" ma:taxonomyFieldName="MediaServiceImageTags" ma:displayName="Image Tags" ma:readOnly="false" ma:fieldId="{5cf76f15-5ced-4ddc-b409-7134ff3c332f}" ma:taxonomyMulti="true" ma:sspId="377c0c84-274e-4e18-9d0b-7c009be74b2d" ma:termSetId="09814cd3-568e-fe90-9814-8d621ff8fb84" ma:anchorId="fba54fb3-c3e1-fe81-a776-ca4b69148c4d" ma:open="true" ma:isKeyword="false">
       <xsd:complexType>
         <xsd:sequence>
           <xsd:element ref="pc:Terms" minOccurs="0" maxOccurs="1"/>
         </xsd:sequence>
       </xsd:complexType>
     </xsd:element>
-    <xsd:element name="MediaServiceOCR" ma:index="18" nillable="true" ma:displayName="Extracted Text" ma:internalName="MediaServiceOCR" ma:readOnly="true">
+    <xsd:element name="MediaServiceOCR" ma:index="14" nillable="true" ma:displayName="Extracted Text" ma:internalName="MediaServiceOCR" ma:readOnly="true">
       <xsd:simpleType>
         <xsd:restriction base="dms:Note">
           <xsd:maxLength value="255"/>
         </xsd:restriction>
       </xsd:simpleType>
     </xsd:element>
-  </xsd:schema>
-  <xsd:schema xmlns:xsd="http://www.w3.org/2001/XMLSchema" xmlns:xs="http://www.w3.org/2001/XMLSchema" xmlns:dms="http://schemas.microsoft.com/office/2006/documentManagement/types" xmlns:pc="http://schemas.microsoft.com/office/infopath/2007/PartnerControls" targetNamespace="2933af51-6e9d-478c-9ebc-1dbb8c3cbba4" elementFormDefault="qualified">
-    <xsd:import namespace="http://schemas.microsoft.com/office/2006/documentManagement/types"/>
-    <xsd:import namespace="http://schemas.microsoft.com/office/infopath/2007/PartnerControls"/>
-    <xsd:element name="TaxCatchAll" ma:index="17" nillable="true" ma:displayName="Taxonomy Catch All Column" ma:hidden="true" ma:list="{662ccf49-f995-4e27-befa-27afc00b09ea}" ma:internalName="TaxCatchAll" ma:showField="CatchAllData" ma:web="2933af51-6e9d-478c-9ebc-1dbb8c3cbba4">
-      <xsd:complexType>
-        <xsd:complexContent>
-          <xsd:extension base="dms:MultiChoiceLookup">
-            <xsd:sequence>
-              <xsd:element name="Value" type="dms:Lookup" maxOccurs="unbounded" minOccurs="0" nillable="true"/>
-            </xsd:sequence>
-          </xsd:extension>
-        </xsd:complexContent>
-      </xsd:complexType>
+    <xsd:element name="MediaServiceGenerationTime" ma:index="15" nillable="true" ma:displayName="MediaServiceGenerationTime" ma:hidden="true" ma:internalName="MediaServiceGenerationTime" ma:readOnly="true">
+      <xsd:simpleType>
+        <xsd:restriction base="dms:Text"/>
+      </xsd:simpleType>
+    </xsd:element>
+    <xsd:element name="MediaServiceEventHashCode" ma:index="16" nillable="true" ma:displayName="MediaServiceEventHashCode" ma:hidden="true" ma:internalName="MediaServiceEventHashCode" ma:readOnly="true">
+      <xsd:simpleType>
+        <xsd:restriction base="dms:Text"/>
+      </xsd:simpleType>
     </xsd:element>
   </xsd:schema>
   <xsd:schema xmlns="http://schemas.openxmlformats.org/package/2006/metadata/core-properties" xmlns:xsd="http://www.w3.org/2001/XMLSchema" xmlns:xsi="http://www.w3.org/2001/XMLSchema-instance" xmlns:dc="http://purl.org/dc/elements/1.1/" xmlns:dcterms="http://purl.org/dc/terms/" xmlns:odoc="http://schemas.microsoft.com/internal/obd" targetNamespace="http://schemas.openxmlformats.org/package/2006/metadata/core-properties" elementFormDefault="qualified" attributeFormDefault="unqualified" blockDefault="#all">
@@ -14979,27 +14970,7 @@
 </ct:contentTypeSchema>
 </file>
 
-<file path=customXml/item4.xml><?xml version="1.0" encoding="utf-8"?>
-<?mso-contentType ?>
-<FormTemplates xmlns="http://schemas.microsoft.com/sharepoint/v3/contenttype/forms">
-  <Display>DocumentLibraryForm</Display>
-  <Edit>DocumentLibraryForm</Edit>
-  <New>DocumentLibraryForm</New>
-</FormTemplates>
-</file>
-
 <file path=customXml/itemProps1.xml><?xml version="1.0" encoding="utf-8"?>
-<ds:datastoreItem xmlns:ds="http://schemas.openxmlformats.org/officeDocument/2006/customXml" ds:itemID="{73831696-B938-4189-AB40-050444CB6DD8}">
-  <ds:schemaRefs>
-    <ds:schemaRef ds:uri="http://schemas.microsoft.com/office/2006/metadata/properties"/>
-    <ds:schemaRef ds:uri="http://schemas.microsoft.com/office/infopath/2007/PartnerControls"/>
-    <ds:schemaRef ds:uri="8329c55f-d416-4a1f-b2d3-fc9ae7cbffd5"/>
-    <ds:schemaRef ds:uri="2933af51-6e9d-478c-9ebc-1dbb8c3cbba4"/>
-  </ds:schemaRefs>
-</ds:datastoreItem>
-</file>
-
-<file path=customXml/itemProps2.xml><?xml version="1.0" encoding="utf-8"?>
 <ds:datastoreItem xmlns:ds="http://schemas.openxmlformats.org/officeDocument/2006/customXml" ds:itemID="{EF278816-EC6F-A645-907D-7F25AECB1D4A}">
   <ds:schemaRefs>
     <ds:schemaRef ds:uri="http://schemas.openxmlformats.org/officeDocument/2006/bibliography"/>
@@ -15007,29 +14978,24 @@
 </ds:datastoreItem>
 </file>
 
+<file path=customXml/itemProps2.xml><?xml version="1.0" encoding="utf-8"?>
+<ds:datastoreItem xmlns:ds="http://schemas.openxmlformats.org/officeDocument/2006/customXml" ds:itemID="{73831696-B938-4189-AB40-050444CB6DD8}">
+  <ds:schemaRefs>
+    <ds:schemaRef ds:uri="http://schemas.microsoft.com/office/2006/metadata/properties"/>
+    <ds:schemaRef ds:uri="http://schemas.microsoft.com/office/infopath/2007/PartnerControls"/>
+    <ds:schemaRef ds:uri="23a8e06d-7422-43a7-9a1b-52b8c23ca3f8"/>
+  </ds:schemaRefs>
+</ds:datastoreItem>
+</file>
+
 <file path=customXml/itemProps3.xml><?xml version="1.0" encoding="utf-8"?>
-<ds:datastoreItem xmlns:ds="http://schemas.openxmlformats.org/officeDocument/2006/customXml" ds:itemID="{B72A4674-F0DB-4163-8157-FBEBBF1C88B8}">
+<ds:datastoreItem xmlns:ds="http://schemas.openxmlformats.org/officeDocument/2006/customXml" ds:itemID="{1979DC91-FFF5-4823-8C86-F707888912E6}">
   <ds:schemaRefs>
-    <ds:schemaRef ds:uri="http://schemas.microsoft.com/office/2006/metadata/contentType"/>
-    <ds:schemaRef ds:uri="http://schemas.microsoft.com/office/2006/metadata/properties/metaAttributes"/>
-    <ds:schemaRef ds:uri="http://www.w3.org/2001/XMLSchema"/>
-    <ds:schemaRef ds:uri="http://schemas.microsoft.com/office/2006/metadata/properties"/>
-    <ds:schemaRef ds:uri="8329c55f-d416-4a1f-b2d3-fc9ae7cbffd5"/>
-    <ds:schemaRef ds:uri="2933af51-6e9d-478c-9ebc-1dbb8c3cbba4"/>
-    <ds:schemaRef ds:uri="http://schemas.microsoft.com/office/2006/documentManagement/types"/>
-    <ds:schemaRef ds:uri="http://schemas.microsoft.com/office/infopath/2007/PartnerControls"/>
-    <ds:schemaRef ds:uri="http://schemas.openxmlformats.org/package/2006/metadata/core-properties"/>
-    <ds:schemaRef ds:uri="http://purl.org/dc/elements/1.1/"/>
-    <ds:schemaRef ds:uri="http://purl.org/dc/terms/"/>
-    <ds:schemaRef ds:uri="http://schemas.microsoft.com/internal/obd"/>
+    <ds:schemaRef ds:uri="http://schemas.microsoft.com/sharepoint/v3/contenttype/forms"/>
   </ds:schemaRefs>
 </ds:datastoreItem>
 </file>
 
 <file path=customXml/itemProps4.xml><?xml version="1.0" encoding="utf-8"?>
-<ds:datastoreItem xmlns:ds="http://schemas.openxmlformats.org/officeDocument/2006/customXml" ds:itemID="{1979DC91-FFF5-4823-8C86-F707888912E6}">
-  <ds:schemaRefs>
-    <ds:schemaRef ds:uri="http://schemas.microsoft.com/sharepoint/v3/contenttype/forms"/>
-  </ds:schemaRefs>
-</ds:datastoreItem>
+<ds:datastoreItem xmlns:ds="http://schemas.openxmlformats.org/officeDocument/2006/customXml" ds:itemID="{A46E0841-F3A7-40D1-A5B7-FF34C163BB29}"/>
 </file>
</xml_diff>